<commit_message>
Use original black Poveon logo and add CEO signature
Switch the cover and header logo to the original black Poveon mark from
the website (public/logo.svg) instead of the recoloured version, and add
an elegant cursive signature for Dr. Manuwa Toluwalase on the "For Poveon
LTD" signature line on the execution page.

Co-Authored-By: Claude Opus 4.8 <noreply@anthropic.com>
Claude-Session: https://claude.ai/code/session_01FSyYG7VMzgZkYGnojYW7E8
</commit_message>
<xml_diff>
--- a/Poveon_Executive_Revenue_Sharing_and_Performance_Agreement.docx
+++ b/Poveon_Executive_Revenue_Sharing_and_Performance_Agreement.docx
@@ -15,7 +15,7 @@
       <w:r>
         <w:drawing>
           <wp:inline xmlns:a="http://schemas.openxmlformats.org/drawingml/2006/main" xmlns:pic="http://schemas.openxmlformats.org/drawingml/2006/picture">
-            <wp:extent cx="1325880" cy="1312621"/>
+            <wp:extent cx="1280160" cy="1267358"/>
             <wp:docPr id="1" name="Picture 1"/>
             <wp:cNvGraphicFramePr>
               <a:graphicFrameLocks noChangeAspect="1"/>
@@ -36,7 +36,7 @@
                   <pic:spPr>
                     <a:xfrm>
                       <a:off x="0" y="0"/>
-                      <a:ext cx="1325880" cy="1312621"/>
+                      <a:ext cx="1280160" cy="1267358"/>
                     </a:xfrm>
                     <a:prstGeom prst="rect"/>
                   </pic:spPr>
@@ -8908,7 +8908,7 @@
     </w:p>
     <w:p>
       <w:pPr>
-        <w:spacing w:before="0" w:after="160" w:line="276" w:lineRule="auto"/>
+        <w:spacing w:before="0" w:after="80" w:line="276" w:lineRule="auto"/>
       </w:pPr>
     </w:p>
     <w:p>
@@ -8924,11 +8924,38 @@
         <w:t xml:space="preserve">Signature:  </w:t>
       </w:r>
       <w:r>
-        <w:rPr>
-          <w:rFonts w:ascii="Calibri" w:hAnsi="Calibri"/>
-          <w:sz w:val="21"/>
-        </w:rPr>
-        <w:t>_______________________________________</w:t>
+        <w:drawing>
+          <wp:inline xmlns:a="http://schemas.openxmlformats.org/drawingml/2006/main" xmlns:pic="http://schemas.openxmlformats.org/drawingml/2006/picture">
+            <wp:extent cx="1920240" cy="521208"/>
+            <wp:docPr id="2" name="Picture 2"/>
+            <wp:cNvGraphicFramePr>
+              <a:graphicFrameLocks noChangeAspect="1"/>
+            </wp:cNvGraphicFramePr>
+            <a:graphic>
+              <a:graphicData uri="http://schemas.openxmlformats.org/drawingml/2006/picture">
+                <pic:pic>
+                  <pic:nvPicPr>
+                    <pic:cNvPr id="0" name="signature.png"/>
+                    <pic:cNvPicPr/>
+                  </pic:nvPicPr>
+                  <pic:blipFill>
+                    <a:blip r:embed="rId12"/>
+                    <a:stretch>
+                      <a:fillRect/>
+                    </a:stretch>
+                  </pic:blipFill>
+                  <pic:spPr>
+                    <a:xfrm>
+                      <a:off x="0" y="0"/>
+                      <a:ext cx="1920240" cy="521208"/>
+                    </a:xfrm>
+                    <a:prstGeom prst="rect"/>
+                  </pic:spPr>
+                </pic:pic>
+              </a:graphicData>
+            </a:graphic>
+          </wp:inline>
+        </w:drawing>
       </w:r>
     </w:p>
     <w:p>
@@ -9018,7 +9045,7 @@
     </w:p>
     <w:p>
       <w:pPr>
-        <w:spacing w:before="0" w:after="160" w:line="276" w:lineRule="auto"/>
+        <w:spacing w:before="0" w:after="80" w:line="276" w:lineRule="auto"/>
       </w:pPr>
     </w:p>
     <w:p>
@@ -13728,7 +13755,7 @@
           <w:r>
             <w:drawing>
               <wp:inline xmlns:a="http://schemas.openxmlformats.org/drawingml/2006/main" xmlns:pic="http://schemas.openxmlformats.org/drawingml/2006/picture">
-                <wp:extent cx="310896" cy="308305"/>
+                <wp:extent cx="310896" cy="307010"/>
                 <wp:docPr id="1" name="Picture 1"/>
                 <wp:cNvGraphicFramePr>
                   <a:graphicFrameLocks noChangeAspect="1"/>
@@ -13749,7 +13776,7 @@
                       <pic:spPr>
                         <a:xfrm>
                           <a:off x="0" y="0"/>
-                          <a:ext cx="310896" cy="308305"/>
+                          <a:ext cx="310896" cy="307010"/>
                         </a:xfrm>
                         <a:prstGeom prst="rect"/>
                       </pic:spPr>

</xml_diff>